<commit_message>
Final website files and 7760 document
</commit_message>
<xml_diff>
--- a/JavaTutorial/Day1_Introduction_programming.docx
+++ b/JavaTutorial/Day1_Introduction_programming.docx
@@ -27,7 +27,7 @@
           <w:pPr>
             <w:pStyle w:val="TOC1"/>
             <w:tabs>
-              <w:tab w:val="left" w:pos="1200"/>
+              <w:tab w:val="left" w:pos="480"/>
             </w:tabs>
             <w:rPr>
               <w:rFonts w:asciiTheme="minorHAnsi" w:eastAsiaTheme="minorEastAsia" w:hAnsiTheme="minorHAnsi" w:cstheme="minorBidi"/>
@@ -45,21 +45,7 @@
           <w:r>
             <w:fldChar w:fldCharType="separate"/>
           </w:r>
-        </w:p>
-        <w:p>
-          <w:pPr>
-            <w:pStyle w:val="TOC1"/>
-            <w:tabs>
-              <w:tab w:val="left" w:pos="480"/>
-            </w:tabs>
-            <w:rPr>
-              <w:rFonts w:asciiTheme="minorHAnsi" w:eastAsiaTheme="minorEastAsia" w:hAnsiTheme="minorHAnsi" w:cstheme="minorBidi"/>
-              <w:noProof/>
-              <w:lang w:eastAsia="en-US" w:bidi="ar-SA"/>
-              <w14:ligatures w14:val="standardContextual"/>
-            </w:rPr>
-          </w:pPr>
-          <w:hyperlink w:anchor="_Toc235304539" w:history="1">
+          <w:hyperlink w:anchor="_Toc235526042" w:history="1">
             <w:r>
               <w:rPr>
                 <w:rStyle w:val="Hyperlink"/>
@@ -102,7 +88,7 @@
                 <w:noProof/>
                 <w:webHidden/>
               </w:rPr>
-              <w:instrText xml:space="preserve"> PAGEREF _Toc235304539 \h </w:instrText>
+              <w:instrText xml:space="preserve"> PAGEREF _Toc235526042 \h </w:instrText>
             </w:r>
             <w:r>
               <w:rPr>
@@ -122,7 +108,7 @@
                 <w:noProof/>
                 <w:webHidden/>
               </w:rPr>
-              <w:t>1</w:t>
+              <w:t>2</w:t>
             </w:r>
             <w:r>
               <w:rPr>
@@ -143,7 +129,7 @@
               <w14:ligatures w14:val="standardContextual"/>
             </w:rPr>
           </w:pPr>
-          <w:hyperlink w:anchor="_Toc235304540" w:history="1">
+          <w:hyperlink w:anchor="_Toc235526043" w:history="1">
             <w:r>
               <w:rPr>
                 <w:rStyle w:val="Hyperlink"/>
@@ -170,7 +156,7 @@
                 <w:noProof/>
                 <w:webHidden/>
               </w:rPr>
-              <w:instrText xml:space="preserve"> PAGEREF _Toc235304540 \h </w:instrText>
+              <w:instrText xml:space="preserve"> PAGEREF _Toc235526043 \h </w:instrText>
             </w:r>
             <w:r>
               <w:rPr>
@@ -211,7 +197,7 @@
               <w14:ligatures w14:val="standardContextual"/>
             </w:rPr>
           </w:pPr>
-          <w:hyperlink w:anchor="_Toc235304541" w:history="1">
+          <w:hyperlink w:anchor="_Toc235526044" w:history="1">
             <w:r>
               <w:rPr>
                 <w:rStyle w:val="Hyperlink"/>
@@ -238,7 +224,7 @@
                 <w:noProof/>
                 <w:webHidden/>
               </w:rPr>
-              <w:instrText xml:space="preserve"> PAGEREF _Toc235304541 \h </w:instrText>
+              <w:instrText xml:space="preserve"> PAGEREF _Toc235526044 \h </w:instrText>
             </w:r>
             <w:r>
               <w:rPr>
@@ -258,7 +244,7 @@
                 <w:noProof/>
                 <w:webHidden/>
               </w:rPr>
-              <w:t>2</w:t>
+              <w:t>3</w:t>
             </w:r>
             <w:r>
               <w:rPr>
@@ -282,7 +268,7 @@
               <w14:ligatures w14:val="standardContextual"/>
             </w:rPr>
           </w:pPr>
-          <w:hyperlink w:anchor="_Toc235304542" w:history="1">
+          <w:hyperlink w:anchor="_Toc235526045" w:history="1">
             <w:r>
               <w:rPr>
                 <w:rStyle w:val="Hyperlink"/>
@@ -325,7 +311,7 @@
                 <w:noProof/>
                 <w:webHidden/>
               </w:rPr>
-              <w:instrText xml:space="preserve"> PAGEREF _Toc235304542 \h </w:instrText>
+              <w:instrText xml:space="preserve"> PAGEREF _Toc235526045 \h </w:instrText>
             </w:r>
             <w:r>
               <w:rPr>
@@ -345,7 +331,7 @@
                 <w:noProof/>
                 <w:webHidden/>
               </w:rPr>
-              <w:t>3</w:t>
+              <w:t>4</w:t>
             </w:r>
             <w:r>
               <w:rPr>
@@ -366,7 +352,7 @@
               <w14:ligatures w14:val="standardContextual"/>
             </w:rPr>
           </w:pPr>
-          <w:hyperlink w:anchor="_Toc235304543" w:history="1">
+          <w:hyperlink w:anchor="_Toc235526046" w:history="1">
             <w:r>
               <w:rPr>
                 <w:rStyle w:val="Hyperlink"/>
@@ -393,7 +379,7 @@
                 <w:noProof/>
                 <w:webHidden/>
               </w:rPr>
-              <w:instrText xml:space="preserve"> PAGEREF _Toc235304543 \h </w:instrText>
+              <w:instrText xml:space="preserve"> PAGEREF _Toc235526046 \h </w:instrText>
             </w:r>
             <w:r>
               <w:rPr>
@@ -413,7 +399,7 @@
                 <w:noProof/>
                 <w:webHidden/>
               </w:rPr>
-              <w:t>3</w:t>
+              <w:t>4</w:t>
             </w:r>
             <w:r>
               <w:rPr>
@@ -434,7 +420,7 @@
               <w14:ligatures w14:val="standardContextual"/>
             </w:rPr>
           </w:pPr>
-          <w:hyperlink w:anchor="_Toc235304544" w:history="1">
+          <w:hyperlink w:anchor="_Toc235526047" w:history="1">
             <w:r>
               <w:rPr>
                 <w:rStyle w:val="Hyperlink"/>
@@ -461,7 +447,7 @@
                 <w:noProof/>
                 <w:webHidden/>
               </w:rPr>
-              <w:instrText xml:space="preserve"> PAGEREF _Toc235304544 \h </w:instrText>
+              <w:instrText xml:space="preserve"> PAGEREF _Toc235526047 \h </w:instrText>
             </w:r>
             <w:r>
               <w:rPr>
@@ -481,7 +467,7 @@
                 <w:noProof/>
                 <w:webHidden/>
               </w:rPr>
-              <w:t>4</w:t>
+              <w:t>5</w:t>
             </w:r>
             <w:r>
               <w:rPr>
@@ -502,7 +488,7 @@
               <w14:ligatures w14:val="standardContextual"/>
             </w:rPr>
           </w:pPr>
-          <w:hyperlink w:anchor="_Toc235304545" w:history="1">
+          <w:hyperlink w:anchor="_Toc235526048" w:history="1">
             <w:r>
               <w:rPr>
                 <w:rStyle w:val="Hyperlink"/>
@@ -529,7 +515,7 @@
                 <w:noProof/>
                 <w:webHidden/>
               </w:rPr>
-              <w:instrText xml:space="preserve"> PAGEREF _Toc235304545 \h </w:instrText>
+              <w:instrText xml:space="preserve"> PAGEREF _Toc235526048 \h </w:instrText>
             </w:r>
             <w:r>
               <w:rPr>
@@ -549,7 +535,7 @@
                 <w:noProof/>
                 <w:webHidden/>
               </w:rPr>
-              <w:t>5</w:t>
+              <w:t>6</w:t>
             </w:r>
             <w:r>
               <w:rPr>
@@ -573,7 +559,7 @@
               <w14:ligatures w14:val="standardContextual"/>
             </w:rPr>
           </w:pPr>
-          <w:hyperlink w:anchor="_Toc235304546" w:history="1">
+          <w:hyperlink w:anchor="_Toc235526049" w:history="1">
             <w:r>
               <w:rPr>
                 <w:rStyle w:val="Hyperlink"/>
@@ -616,7 +602,7 @@
                 <w:noProof/>
                 <w:webHidden/>
               </w:rPr>
-              <w:instrText xml:space="preserve"> PAGEREF _Toc235304546 \h </w:instrText>
+              <w:instrText xml:space="preserve"> PAGEREF _Toc235526049 \h </w:instrText>
             </w:r>
             <w:r>
               <w:rPr>
@@ -636,7 +622,7 @@
                 <w:noProof/>
                 <w:webHidden/>
               </w:rPr>
-              <w:t>7</w:t>
+              <w:t>8</w:t>
             </w:r>
             <w:r>
               <w:rPr>
@@ -657,7 +643,7 @@
               <w14:ligatures w14:val="standardContextual"/>
             </w:rPr>
           </w:pPr>
-          <w:hyperlink w:anchor="_Toc235304547" w:history="1">
+          <w:hyperlink w:anchor="_Toc235526050" w:history="1">
             <w:r>
               <w:rPr>
                 <w:rStyle w:val="Hyperlink"/>
@@ -684,7 +670,7 @@
                 <w:noProof/>
                 <w:webHidden/>
               </w:rPr>
-              <w:instrText xml:space="preserve"> PAGEREF _Toc235304547 \h </w:instrText>
+              <w:instrText xml:space="preserve"> PAGEREF _Toc235526050 \h </w:instrText>
             </w:r>
             <w:r>
               <w:rPr>
@@ -704,7 +690,7 @@
                 <w:noProof/>
                 <w:webHidden/>
               </w:rPr>
-              <w:t>9</w:t>
+              <w:t>10</w:t>
             </w:r>
             <w:r>
               <w:rPr>
@@ -725,7 +711,7 @@
               <w14:ligatures w14:val="standardContextual"/>
             </w:rPr>
           </w:pPr>
-          <w:hyperlink w:anchor="_Toc235304548" w:history="1">
+          <w:hyperlink w:anchor="_Toc235526051" w:history="1">
             <w:r>
               <w:rPr>
                 <w:rStyle w:val="Hyperlink"/>
@@ -752,7 +738,7 @@
                 <w:noProof/>
                 <w:webHidden/>
               </w:rPr>
-              <w:instrText xml:space="preserve"> PAGEREF _Toc235304548 \h </w:instrText>
+              <w:instrText xml:space="preserve"> PAGEREF _Toc235526051 \h </w:instrText>
             </w:r>
             <w:r>
               <w:rPr>
@@ -772,7 +758,7 @@
                 <w:noProof/>
                 <w:webHidden/>
               </w:rPr>
-              <w:t>10</w:t>
+              <w:t>11</w:t>
             </w:r>
             <w:r>
               <w:rPr>
@@ -796,7 +782,7 @@
               <w14:ligatures w14:val="standardContextual"/>
             </w:rPr>
           </w:pPr>
-          <w:hyperlink w:anchor="_Toc235304549" w:history="1">
+          <w:hyperlink w:anchor="_Toc235526052" w:history="1">
             <w:r>
               <w:rPr>
                 <w:rStyle w:val="Hyperlink"/>
@@ -839,7 +825,7 @@
                 <w:noProof/>
                 <w:webHidden/>
               </w:rPr>
-              <w:instrText xml:space="preserve"> PAGEREF _Toc235304549 \h </w:instrText>
+              <w:instrText xml:space="preserve"> PAGEREF _Toc235526052 \h </w:instrText>
             </w:r>
             <w:r>
               <w:rPr>
@@ -859,7 +845,7 @@
                 <w:noProof/>
                 <w:webHidden/>
               </w:rPr>
-              <w:t>12</w:t>
+              <w:t>13</w:t>
             </w:r>
             <w:r>
               <w:rPr>
@@ -880,7 +866,7 @@
               <w14:ligatures w14:val="standardContextual"/>
             </w:rPr>
           </w:pPr>
-          <w:hyperlink w:anchor="_Toc235304550" w:history="1">
+          <w:hyperlink w:anchor="_Toc235526053" w:history="1">
             <w:r>
               <w:rPr>
                 <w:rStyle w:val="Hyperlink"/>
@@ -907,7 +893,7 @@
                 <w:noProof/>
                 <w:webHidden/>
               </w:rPr>
-              <w:instrText xml:space="preserve"> PAGEREF _Toc235304550 \h </w:instrText>
+              <w:instrText xml:space="preserve"> PAGEREF _Toc235526053 \h </w:instrText>
             </w:r>
             <w:r>
               <w:rPr>
@@ -927,7 +913,7 @@
                 <w:noProof/>
                 <w:webHidden/>
               </w:rPr>
-              <w:t>12</w:t>
+              <w:t>13</w:t>
             </w:r>
             <w:r>
               <w:rPr>
@@ -948,7 +934,7 @@
               <w14:ligatures w14:val="standardContextual"/>
             </w:rPr>
           </w:pPr>
-          <w:hyperlink w:anchor="_Toc235304551" w:history="1">
+          <w:hyperlink w:anchor="_Toc235526054" w:history="1">
             <w:r>
               <w:rPr>
                 <w:rStyle w:val="Hyperlink"/>
@@ -991,7 +977,7 @@
                 <w:noProof/>
                 <w:webHidden/>
               </w:rPr>
-              <w:instrText xml:space="preserve"> PAGEREF _Toc235304551 \h </w:instrText>
+              <w:instrText xml:space="preserve"> PAGEREF _Toc235526054 \h </w:instrText>
             </w:r>
             <w:r>
               <w:rPr>
@@ -1011,7 +997,7 @@
                 <w:noProof/>
                 <w:webHidden/>
               </w:rPr>
-              <w:t>14</w:t>
+              <w:t>15</w:t>
             </w:r>
             <w:r>
               <w:rPr>
@@ -1032,7 +1018,7 @@
               <w14:ligatures w14:val="standardContextual"/>
             </w:rPr>
           </w:pPr>
-          <w:hyperlink w:anchor="_Toc235304552" w:history="1">
+          <w:hyperlink w:anchor="_Toc235526055" w:history="1">
             <w:r>
               <w:rPr>
                 <w:rStyle w:val="Hyperlink"/>
@@ -1060,7 +1046,7 @@
                 <w:noProof/>
                 <w:webHidden/>
               </w:rPr>
-              <w:instrText xml:space="preserve"> PAGEREF _Toc235304552 \h </w:instrText>
+              <w:instrText xml:space="preserve"> PAGEREF _Toc235526055 \h </w:instrText>
             </w:r>
             <w:r>
               <w:rPr>
@@ -1080,7 +1066,7 @@
                 <w:noProof/>
                 <w:webHidden/>
               </w:rPr>
-              <w:t>15</w:t>
+              <w:t>16</w:t>
             </w:r>
             <w:r>
               <w:rPr>
@@ -1101,21 +1087,13 @@
               <w14:ligatures w14:val="standardContextual"/>
             </w:rPr>
           </w:pPr>
-          <w:hyperlink w:anchor="_Toc235304553" w:history="1">
+          <w:hyperlink w:anchor="_Toc235526056" w:history="1">
             <w:r>
               <w:rPr>
                 <w:rStyle w:val="Hyperlink"/>
                 <w:noProof/>
-                <w:lang w:eastAsia="en-US"/>
-              </w:rPr>
-              <w:t xml:space="preserve">Number system - </w:t>
-            </w:r>
-            <w:r>
-              <w:rPr>
-                <w:rStyle w:val="Hyperlink"/>
-                <w:noProof/>
-              </w:rPr>
-              <w:t>Hexa-decimal number (Base-16)</w:t>
+              </w:rPr>
+              <w:t>Type Casting in Java</w:t>
             </w:r>
             <w:r>
               <w:rPr>
@@ -1136,7 +1114,7 @@
                 <w:noProof/>
                 <w:webHidden/>
               </w:rPr>
-              <w:instrText xml:space="preserve"> PAGEREF _Toc235304553 \h </w:instrText>
+              <w:instrText xml:space="preserve"> PAGEREF _Toc235526056 \h </w:instrText>
             </w:r>
             <w:r>
               <w:rPr>
@@ -1156,7 +1134,7 @@
                 <w:noProof/>
                 <w:webHidden/>
               </w:rPr>
-              <w:t>16</w:t>
+              <w:t>17</w:t>
             </w:r>
             <w:r>
               <w:rPr>
@@ -1177,13 +1155,13 @@
               <w14:ligatures w14:val="standardContextual"/>
             </w:rPr>
           </w:pPr>
-          <w:hyperlink w:anchor="_Toc235304554" w:history="1">
+          <w:hyperlink w:anchor="_Toc235526057" w:history="1">
             <w:r>
               <w:rPr>
                 <w:rStyle w:val="Hyperlink"/>
                 <w:noProof/>
               </w:rPr>
-              <w:t>Conversion between number systems</w:t>
+              <w:t>Widening Type Casting</w:t>
             </w:r>
             <w:r>
               <w:rPr>
@@ -1204,7 +1182,7 @@
                 <w:noProof/>
                 <w:webHidden/>
               </w:rPr>
-              <w:instrText xml:space="preserve"> PAGEREF _Toc235304554 \h </w:instrText>
+              <w:instrText xml:space="preserve"> PAGEREF _Toc235526057 \h </w:instrText>
             </w:r>
             <w:r>
               <w:rPr>
@@ -1225,6 +1203,218 @@
                 <w:webHidden/>
               </w:rPr>
               <w:t>17</w:t>
+            </w:r>
+            <w:r>
+              <w:rPr>
+                <w:noProof/>
+                <w:webHidden/>
+              </w:rPr>
+              <w:fldChar w:fldCharType="end"/>
+            </w:r>
+          </w:hyperlink>
+        </w:p>
+        <w:p>
+          <w:pPr>
+            <w:pStyle w:val="TOC2"/>
+            <w:rPr>
+              <w:rFonts w:asciiTheme="minorHAnsi" w:eastAsiaTheme="minorEastAsia" w:hAnsiTheme="minorHAnsi" w:cstheme="minorBidi"/>
+              <w:noProof/>
+              <w:lang w:eastAsia="en-US" w:bidi="ar-SA"/>
+              <w14:ligatures w14:val="standardContextual"/>
+            </w:rPr>
+          </w:pPr>
+          <w:hyperlink w:anchor="_Toc235526058" w:history="1">
+            <w:r>
+              <w:rPr>
+                <w:rStyle w:val="Hyperlink"/>
+                <w:noProof/>
+              </w:rPr>
+              <w:t>Narrowing Type Casting</w:t>
+            </w:r>
+            <w:r>
+              <w:rPr>
+                <w:noProof/>
+                <w:webHidden/>
+              </w:rPr>
+              <w:tab/>
+            </w:r>
+            <w:r>
+              <w:rPr>
+                <w:noProof/>
+                <w:webHidden/>
+              </w:rPr>
+              <w:fldChar w:fldCharType="begin"/>
+            </w:r>
+            <w:r>
+              <w:rPr>
+                <w:noProof/>
+                <w:webHidden/>
+              </w:rPr>
+              <w:instrText xml:space="preserve"> PAGEREF _Toc235526058 \h </w:instrText>
+            </w:r>
+            <w:r>
+              <w:rPr>
+                <w:noProof/>
+                <w:webHidden/>
+              </w:rPr>
+            </w:r>
+            <w:r>
+              <w:rPr>
+                <w:noProof/>
+                <w:webHidden/>
+              </w:rPr>
+              <w:fldChar w:fldCharType="separate"/>
+            </w:r>
+            <w:r>
+              <w:rPr>
+                <w:noProof/>
+                <w:webHidden/>
+              </w:rPr>
+              <w:t>18</w:t>
+            </w:r>
+            <w:r>
+              <w:rPr>
+                <w:noProof/>
+                <w:webHidden/>
+              </w:rPr>
+              <w:fldChar w:fldCharType="end"/>
+            </w:r>
+          </w:hyperlink>
+        </w:p>
+        <w:p>
+          <w:pPr>
+            <w:pStyle w:val="TOC1"/>
+            <w:rPr>
+              <w:rFonts w:asciiTheme="minorHAnsi" w:eastAsiaTheme="minorEastAsia" w:hAnsiTheme="minorHAnsi" w:cstheme="minorBidi"/>
+              <w:noProof/>
+              <w:lang w:eastAsia="en-US" w:bidi="ar-SA"/>
+              <w14:ligatures w14:val="standardContextual"/>
+            </w:rPr>
+          </w:pPr>
+          <w:hyperlink w:anchor="_Toc235526059" w:history="1">
+            <w:r>
+              <w:rPr>
+                <w:rStyle w:val="Hyperlink"/>
+                <w:noProof/>
+                <w:lang w:eastAsia="en-US"/>
+              </w:rPr>
+              <w:t xml:space="preserve">Number system - </w:t>
+            </w:r>
+            <w:r>
+              <w:rPr>
+                <w:rStyle w:val="Hyperlink"/>
+                <w:noProof/>
+              </w:rPr>
+              <w:t>Hexa-decimal number (Base-16)</w:t>
+            </w:r>
+            <w:r>
+              <w:rPr>
+                <w:noProof/>
+                <w:webHidden/>
+              </w:rPr>
+              <w:tab/>
+            </w:r>
+            <w:r>
+              <w:rPr>
+                <w:noProof/>
+                <w:webHidden/>
+              </w:rPr>
+              <w:fldChar w:fldCharType="begin"/>
+            </w:r>
+            <w:r>
+              <w:rPr>
+                <w:noProof/>
+                <w:webHidden/>
+              </w:rPr>
+              <w:instrText xml:space="preserve"> PAGEREF _Toc235526059 \h </w:instrText>
+            </w:r>
+            <w:r>
+              <w:rPr>
+                <w:noProof/>
+                <w:webHidden/>
+              </w:rPr>
+            </w:r>
+            <w:r>
+              <w:rPr>
+                <w:noProof/>
+                <w:webHidden/>
+              </w:rPr>
+              <w:fldChar w:fldCharType="separate"/>
+            </w:r>
+            <w:r>
+              <w:rPr>
+                <w:noProof/>
+                <w:webHidden/>
+              </w:rPr>
+              <w:t>19</w:t>
+            </w:r>
+            <w:r>
+              <w:rPr>
+                <w:noProof/>
+                <w:webHidden/>
+              </w:rPr>
+              <w:fldChar w:fldCharType="end"/>
+            </w:r>
+          </w:hyperlink>
+        </w:p>
+        <w:p>
+          <w:pPr>
+            <w:pStyle w:val="TOC2"/>
+            <w:rPr>
+              <w:rFonts w:asciiTheme="minorHAnsi" w:eastAsiaTheme="minorEastAsia" w:hAnsiTheme="minorHAnsi" w:cstheme="minorBidi"/>
+              <w:noProof/>
+              <w:lang w:eastAsia="en-US" w:bidi="ar-SA"/>
+              <w14:ligatures w14:val="standardContextual"/>
+            </w:rPr>
+          </w:pPr>
+          <w:hyperlink w:anchor="_Toc235526060" w:history="1">
+            <w:r>
+              <w:rPr>
+                <w:rStyle w:val="Hyperlink"/>
+                <w:noProof/>
+              </w:rPr>
+              <w:t>Conversion between number systems</w:t>
+            </w:r>
+            <w:r>
+              <w:rPr>
+                <w:noProof/>
+                <w:webHidden/>
+              </w:rPr>
+              <w:tab/>
+            </w:r>
+            <w:r>
+              <w:rPr>
+                <w:noProof/>
+                <w:webHidden/>
+              </w:rPr>
+              <w:fldChar w:fldCharType="begin"/>
+            </w:r>
+            <w:r>
+              <w:rPr>
+                <w:noProof/>
+                <w:webHidden/>
+              </w:rPr>
+              <w:instrText xml:space="preserve"> PAGEREF _Toc235526060 \h </w:instrText>
+            </w:r>
+            <w:r>
+              <w:rPr>
+                <w:noProof/>
+                <w:webHidden/>
+              </w:rPr>
+            </w:r>
+            <w:r>
+              <w:rPr>
+                <w:noProof/>
+                <w:webHidden/>
+              </w:rPr>
+              <w:fldChar w:fldCharType="separate"/>
+            </w:r>
+            <w:r>
+              <w:rPr>
+                <w:noProof/>
+                <w:webHidden/>
+              </w:rPr>
+              <w:t>20</w:t>
             </w:r>
             <w:r>
               <w:rPr>
@@ -1349,7 +1539,7 @@
         <w:spacing w:before="0" w:after="0" w:line="240" w:lineRule="auto"/>
         <w:contextualSpacing/>
       </w:pPr>
-      <w:bookmarkStart w:id="0" w:name="_Toc235304539"/>
+      <w:bookmarkStart w:id="0" w:name="_Toc235526042"/>
       <w:r>
         <w:lastRenderedPageBreak/>
         <w:t>Set Up Your Tools</w:t>
@@ -1412,7 +1602,7 @@
         <w:spacing w:before="0" w:after="0" w:line="240" w:lineRule="auto"/>
         <w:contextualSpacing/>
       </w:pPr>
-      <w:bookmarkStart w:id="1" w:name="_Toc235304540"/>
+      <w:bookmarkStart w:id="1" w:name="_Toc235526043"/>
       <w:r>
         <w:t>Visual Studio Code for Java development</w:t>
       </w:r>
@@ -1927,7 +2117,7 @@
           <w:numId w:val="0"/>
         </w:numPr>
       </w:pPr>
-      <w:bookmarkStart w:id="2" w:name="_Toc235304541"/>
+      <w:bookmarkStart w:id="2" w:name="_Toc235526044"/>
       <w:r>
         <w:lastRenderedPageBreak/>
         <w:t>What is IDE</w:t>
@@ -2171,7 +2361,7 @@
           <w:numId w:val="28"/>
         </w:numPr>
       </w:pPr>
-      <w:bookmarkStart w:id="3" w:name="_Toc235304542"/>
+      <w:bookmarkStart w:id="3" w:name="_Toc235526045"/>
       <w:r>
         <w:lastRenderedPageBreak/>
         <w:t xml:space="preserve">First </w:t>
@@ -2203,7 +2393,7 @@
           <w:numId w:val="0"/>
         </w:numPr>
       </w:pPr>
-      <w:bookmarkStart w:id="4" w:name="_Toc235304543"/>
+      <w:bookmarkStart w:id="4" w:name="_Toc235526046"/>
       <w:r>
         <w:t xml:space="preserve">Create java project </w:t>
       </w:r>
@@ -3100,7 +3290,7 @@
       <w:pPr>
         <w:pStyle w:val="Heading2"/>
       </w:pPr>
-      <w:bookmarkStart w:id="5" w:name="_Toc235304544"/>
+      <w:bookmarkStart w:id="5" w:name="_Toc235526047"/>
       <w:r>
         <w:lastRenderedPageBreak/>
         <w:t>Understand starting point of Java program</w:t>
@@ -3129,18 +3319,9 @@
           </w:p>
           <w:p>
             <w:r>
-              <w:t xml:space="preserve">    public static void </w:t>
-            </w:r>
-            <w:proofErr w:type="gramStart"/>
-            <w:r>
-              <w:t>main(String[</w:t>
-            </w:r>
-            <w:proofErr w:type="gramEnd"/>
-            <w:r>
-              <w:t xml:space="preserve">] </w:t>
+              <w:t xml:space="preserve">    public static void main(String[] </w:t>
             </w:r>
             <w:proofErr w:type="spellStart"/>
-            <w:proofErr w:type="gramStart"/>
             <w:r>
               <w:t>args</w:t>
             </w:r>
@@ -3148,7 +3329,6 @@
             <w:r>
               <w:t>) {</w:t>
             </w:r>
-            <w:proofErr w:type="gramEnd"/>
           </w:p>
           <w:p>
             <w:r>
@@ -3195,21 +3375,12 @@
                 <w:numId w:val="7"/>
               </w:numPr>
             </w:pPr>
-            <w:proofErr w:type="gramStart"/>
             <w:r>
               <w:rPr>
                 <w:b/>
                 <w:bCs/>
               </w:rPr>
-              <w:t>public</w:t>
-            </w:r>
-            <w:proofErr w:type="gramEnd"/>
-            <w:r>
-              <w:rPr>
-                <w:b/>
-                <w:bCs/>
-              </w:rPr>
-              <w:t xml:space="preserve"> class Main</w:t>
+              <w:t>public class Main</w:t>
             </w:r>
             <w:r>
               <w:t>: Creates a container for your code. The class name must match your file name (e.g., Main.java).</w:t>
@@ -3277,101 +3448,69 @@
                 <w:b/>
                 <w:bCs/>
               </w:rPr>
-              <w:t xml:space="preserve">public static void </w:t>
-            </w:r>
-            <w:proofErr w:type="gramStart"/>
+              <w:t xml:space="preserve">public static void main(String[] </w:t>
+            </w:r>
+            <w:proofErr w:type="spellStart"/>
             <w:r>
               <w:rPr>
                 <w:b/>
                 <w:bCs/>
               </w:rPr>
-              <w:t>main(String[</w:t>
-            </w:r>
-            <w:proofErr w:type="gramEnd"/>
+              <w:t>args</w:t>
+            </w:r>
+            <w:proofErr w:type="spellEnd"/>
             <w:r>
               <w:rPr>
                 <w:b/>
                 <w:bCs/>
               </w:rPr>
-              <w:t xml:space="preserve">] </w:t>
+              <w:t>)</w:t>
+            </w:r>
+            <w:r>
+              <w:t xml:space="preserve"> line is the </w:t>
+            </w:r>
+            <w:r>
+              <w:rPr>
+                <w:b/>
+                <w:bCs/>
+              </w:rPr>
+              <w:t>exact entry point</w:t>
+            </w:r>
+            <w:r>
+              <w:t xml:space="preserve"> for every Java application. When you run a Java program, the Java Virtual Machine (JVM) looks specifically for this exact sequence of words to start executing your code. If any part of it is missing or misspelled, your program will not start.</w:t>
+            </w:r>
+          </w:p>
+          <w:p/>
+          <w:p>
+            <w:r>
+              <w:rPr>
+                <w:b/>
+                <w:bCs/>
+              </w:rPr>
+              <w:t>Compile the code</w:t>
+            </w:r>
+            <w:r>
+              <w:t xml:space="preserve">: Type </w:t>
             </w:r>
             <w:proofErr w:type="spellStart"/>
             <w:r>
+              <w:t>javac</w:t>
+            </w:r>
+            <w:proofErr w:type="spellEnd"/>
+            <w:r>
+              <w:t xml:space="preserve"> Main.java and press Enter to convert your code into machine-readable bytecode.</w:t>
+            </w:r>
+          </w:p>
+          <w:p>
+            <w:r>
               <w:rPr>
                 <w:b/>
                 <w:bCs/>
               </w:rPr>
-              <w:t>args</w:t>
-            </w:r>
-            <w:proofErr w:type="spellEnd"/>
-            <w:r>
-              <w:rPr>
-                <w:b/>
-                <w:bCs/>
-              </w:rPr>
-              <w:t>)</w:t>
-            </w:r>
-            <w:r>
-              <w:t xml:space="preserve"> line is the </w:t>
-            </w:r>
-            <w:r>
-              <w:rPr>
-                <w:b/>
-                <w:bCs/>
-              </w:rPr>
-              <w:t>exact entry point</w:t>
-            </w:r>
-            <w:r>
-              <w:t xml:space="preserve"> for every Java application. When you run a Java program, the Java Virtual Machine (JVM) looks specifically for this exact sequence of words to start executing your code. If any part of it is missing or misspelled, your program will not start.</w:t>
-            </w:r>
-          </w:p>
-          <w:p/>
-          <w:p>
-            <w:r>
-              <w:rPr>
-                <w:b/>
-                <w:bCs/>
-              </w:rPr>
-              <w:t>Compile the code</w:t>
-            </w:r>
-            <w:r>
-              <w:t xml:space="preserve">: Type </w:t>
-            </w:r>
-            <w:proofErr w:type="spellStart"/>
-            <w:r>
-              <w:t>javac</w:t>
-            </w:r>
-            <w:proofErr w:type="spellEnd"/>
-            <w:r>
-              <w:t xml:space="preserve"> Main.java and press Enter to convert your code into machine-readable bytecode.</w:t>
-            </w:r>
-          </w:p>
-          <w:p>
-            <w:r>
-              <w:rPr>
-                <w:b/>
-                <w:bCs/>
-              </w:rPr>
               <w:t>Execute the program</w:t>
             </w:r>
             <w:r>
-              <w:t xml:space="preserve">: Type java Main and press Enter to see your message </w:t>
-            </w:r>
-            <w:proofErr w:type="gramStart"/>
-            <w:r>
-              <w:t>print</w:t>
-            </w:r>
-            <w:proofErr w:type="gramEnd"/>
-            <w:r>
-              <w:t xml:space="preserve"> </w:t>
-            </w:r>
-            <w:proofErr w:type="gramStart"/>
-            <w:r>
-              <w:t>to</w:t>
-            </w:r>
-            <w:proofErr w:type="gramEnd"/>
-            <w:r>
-              <w:t xml:space="preserve"> the console.</w:t>
+              <w:t>: Type java Main and press Enter to see your message print to the console.</w:t>
             </w:r>
           </w:p>
           <w:p>
@@ -3473,15 +3612,7 @@
         <w:jc w:val="both"/>
       </w:pPr>
       <w:r>
-        <w:t xml:space="preserve">You write Java source </w:t>
-      </w:r>
-      <w:proofErr w:type="gramStart"/>
-      <w:r>
-        <w:t>code (.</w:t>
-      </w:r>
-      <w:proofErr w:type="gramEnd"/>
-      <w:r>
-        <w:t>java file).</w:t>
+        <w:t>You write Java source code (.java file).</w:t>
       </w:r>
     </w:p>
     <w:p>
@@ -3508,7 +3639,6 @@
       <w:r>
         <w:t xml:space="preserve">) converts your text into a universal intermediate form called </w:t>
       </w:r>
-      <w:proofErr w:type="gramStart"/>
       <w:r>
         <w:rPr>
           <w:b/>
@@ -3517,11 +3647,7 @@
         <w:t>Bytecode</w:t>
       </w:r>
       <w:r>
-        <w:t xml:space="preserve"> (.</w:t>
-      </w:r>
-      <w:proofErr w:type="gramEnd"/>
-      <w:r>
-        <w:t>class file).</w:t>
+        <w:t xml:space="preserve"> (.class file).</w:t>
       </w:r>
     </w:p>
     <w:p>
@@ -3590,7 +3716,7 @@
       <w:pPr>
         <w:pStyle w:val="Heading2"/>
       </w:pPr>
-      <w:bookmarkStart w:id="6" w:name="_Toc235304545"/>
+      <w:bookmarkStart w:id="6" w:name="_Toc235526048"/>
       <w:r>
         <w:lastRenderedPageBreak/>
         <w:t xml:space="preserve">Compiling and </w:t>
@@ -3623,15 +3749,7 @@
         <w:t>linking</w:t>
       </w:r>
       <w:r>
-        <w:t xml:space="preserve"> are the two distinct steps required to transform your human-readable source code into a functional program that a computer can </w:t>
-      </w:r>
-      <w:proofErr w:type="gramStart"/>
-      <w:r>
-        <w:t>actually execute</w:t>
-      </w:r>
-      <w:proofErr w:type="gramEnd"/>
-      <w:r>
-        <w:t>.</w:t>
+        <w:t xml:space="preserve"> are the two distinct steps required to transform your human-readable source code into a functional program that a computer can actually execute.</w:t>
       </w:r>
       <w:r>
         <w:t xml:space="preserve"> </w:t>
@@ -3755,15 +3873,7 @@
               <w:t>Object Code</w:t>
             </w:r>
             <w:r>
-              <w:t xml:space="preserve"> (individual .obj </w:t>
-            </w:r>
-            <w:proofErr w:type="gramStart"/>
-            <w:r>
-              <w:t>or .o</w:t>
-            </w:r>
-            <w:proofErr w:type="gramEnd"/>
-            <w:r>
-              <w:t xml:space="preserve"> files containing binary instructions).</w:t>
+              <w:t xml:space="preserve"> (individual .obj or .o files containing binary instructions).</w:t>
             </w:r>
           </w:p>
           <w:p>
@@ -3830,15 +3940,7 @@
               <w:t>one file at a time</w:t>
             </w:r>
             <w:r>
-              <w:t xml:space="preserve">. It translates the file successfully even if that file references functions or modules that live in </w:t>
-            </w:r>
-            <w:proofErr w:type="gramStart"/>
-            <w:r>
-              <w:t>a completely separate</w:t>
-            </w:r>
-            <w:proofErr w:type="gramEnd"/>
-            <w:r>
-              <w:t xml:space="preserve"> file.</w:t>
+              <w:t>. It translates the file successfully even if that file references functions or modules that live in a completely separate file.</w:t>
             </w:r>
             <w:r>
               <w:t xml:space="preserve"> </w:t>
@@ -3904,23 +4006,7 @@
               <w:t>What it does</w:t>
             </w:r>
             <w:r>
-              <w:t xml:space="preserve">: The </w:t>
-            </w:r>
-            <w:proofErr w:type="gramStart"/>
-            <w:r>
-              <w:t>linker</w:t>
-            </w:r>
-            <w:proofErr w:type="gramEnd"/>
-            <w:r>
-              <w:t xml:space="preserve"> acts as an assembler. If File A calls a function that is written inside File </w:t>
-            </w:r>
-            <w:proofErr w:type="gramStart"/>
-            <w:r>
-              <w:t>B, or</w:t>
-            </w:r>
-            <w:proofErr w:type="gramEnd"/>
-            <w:r>
-              <w:t xml:space="preserve"> uses a built-in system library (like Java's </w:t>
+              <w:t xml:space="preserve">: The linker acts as an assembler. If File A calls a function that is written inside File B, or uses a built-in system library (like Java's </w:t>
             </w:r>
             <w:proofErr w:type="spellStart"/>
             <w:r>
@@ -3988,15 +4074,7 @@
               <w:t>Java</w:t>
             </w:r>
             <w:r>
-              <w:t xml:space="preserve">, true linking </w:t>
-            </w:r>
-            <w:proofErr w:type="gramStart"/>
-            <w:r>
-              <w:t>actually happens</w:t>
-            </w:r>
-            <w:proofErr w:type="gramEnd"/>
-            <w:r>
-              <w:t xml:space="preserve"> </w:t>
+              <w:t xml:space="preserve">, true linking actually happens </w:t>
             </w:r>
             <w:r>
               <w:rPr>
@@ -4252,7 +4330,7 @@
           <w:numId w:val="30"/>
         </w:numPr>
       </w:pPr>
-      <w:bookmarkStart w:id="7" w:name="_Toc235304546"/>
+      <w:bookmarkStart w:id="7" w:name="_Toc235526049"/>
       <w:r>
         <w:lastRenderedPageBreak/>
         <w:t xml:space="preserve">Primitive </w:t>
@@ -4334,6 +4412,9 @@
         <w:tab/>
       </w:r>
       <w:r>
+        <w:rPr>
+          <w:noProof/>
+        </w:rPr>
         <w:drawing>
           <wp:inline distT="0" distB="0" distL="0" distR="0" wp14:anchorId="013122EF" wp14:editId="6572F0C3">
             <wp:extent cx="5610225" cy="3171190"/>
@@ -4383,6 +4464,9 @@
         <w:contextualSpacing/>
       </w:pPr>
       <w:r>
+        <w:rPr>
+          <w:noProof/>
+        </w:rPr>
         <w:drawing>
           <wp:inline distT="0" distB="0" distL="0" distR="0" wp14:anchorId="578961BB" wp14:editId="0B535D5B">
             <wp:extent cx="6858000" cy="3533775"/>
@@ -4767,7 +4851,7 @@
       <w:pPr>
         <w:pStyle w:val="Heading2"/>
       </w:pPr>
-      <w:bookmarkStart w:id="8" w:name="_Toc235304547"/>
+      <w:bookmarkStart w:id="8" w:name="_Toc235526050"/>
       <w:r>
         <w:lastRenderedPageBreak/>
         <w:t>Variables</w:t>
@@ -4969,6 +5053,9 @@
                     <w:jc w:val="both"/>
                   </w:pPr>
                   <w:r>
+                    <w:rPr>
+                      <w:noProof/>
+                    </w:rPr>
                     <w:drawing>
                       <wp:inline distT="0" distB="0" distL="0" distR="0" wp14:anchorId="666BA560" wp14:editId="45799C1A">
                         <wp:extent cx="2333625" cy="1476375"/>
@@ -5249,7 +5336,7 @@
         <w:pStyle w:val="Heading2"/>
       </w:pPr>
       <w:bookmarkStart w:id="9" w:name="__RefHeading___Toc12048_2398436327"/>
-      <w:bookmarkStart w:id="10" w:name="_Toc235304548"/>
+      <w:bookmarkStart w:id="10" w:name="_Toc235526051"/>
       <w:bookmarkEnd w:id="9"/>
       <w:r>
         <w:lastRenderedPageBreak/>
@@ -5664,7 +5751,6 @@
             <w:r>
               <w:t xml:space="preserve">, </w:t>
             </w:r>
-            <w:proofErr w:type="gramStart"/>
             <w:r>
               <w:rPr>
                 <w:b/>
@@ -5673,11 +5759,7 @@
               <w:t>while</w:t>
             </w:r>
             <w:r>
-              <w:t>,</w:t>
-            </w:r>
-            <w:proofErr w:type="gramEnd"/>
-            <w:r>
-              <w:t xml:space="preserve"> </w:t>
+              <w:t xml:space="preserve">, </w:t>
             </w:r>
             <w:r>
               <w:rPr>
@@ -5961,7 +6043,7 @@
           <w:numId w:val="30"/>
         </w:numPr>
       </w:pPr>
-      <w:bookmarkStart w:id="11" w:name="_Toc235304549"/>
+      <w:bookmarkStart w:id="11" w:name="_Toc235526052"/>
       <w:r>
         <w:lastRenderedPageBreak/>
         <w:t xml:space="preserve">Data </w:t>
@@ -6063,7 +6145,7 @@
         <w:contextualSpacing/>
       </w:pPr>
       <w:bookmarkStart w:id="12" w:name="_Toc187427032"/>
-      <w:bookmarkStart w:id="13" w:name="_Toc235304550"/>
+      <w:bookmarkStart w:id="13" w:name="_Toc235526053"/>
       <w:r>
         <w:t xml:space="preserve">Bit, Byte, Convert Base 2 </w:t>
       </w:r>
@@ -11694,7 +11776,7 @@
         </w:rPr>
       </w:pPr>
       <w:bookmarkStart w:id="14" w:name="_Toc187427036"/>
-      <w:bookmarkStart w:id="15" w:name="_Toc235304551"/>
+      <w:bookmarkStart w:id="15" w:name="_Toc235526054"/>
       <w:r>
         <w:rPr>
           <w:lang w:eastAsia="en-US"/>
@@ -12233,7 +12315,7 @@
           <w:lang w:eastAsia="en-US"/>
         </w:rPr>
       </w:pPr>
-      <w:bookmarkStart w:id="16" w:name="_Toc235304552"/>
+      <w:bookmarkStart w:id="16" w:name="_Toc235526055"/>
       <w:r>
         <w:rPr>
           <w:lang w:eastAsia="en-US"/>
@@ -12386,23 +12468,13 @@
           <w:shd w:val="clear" w:color="auto" w:fill="FFFFFF"/>
         </w:rPr>
       </w:pPr>
-      <w:proofErr w:type="gramStart"/>
       <w:r>
         <w:rPr>
           <w:rFonts w:cstheme="minorHAnsi"/>
           <w:color w:val="333333"/>
           <w:shd w:val="clear" w:color="auto" w:fill="FFFFFF"/>
         </w:rPr>
-        <w:t>byte</w:t>
-      </w:r>
-      <w:proofErr w:type="gramEnd"/>
-      <w:r>
-        <w:rPr>
-          <w:rFonts w:cstheme="minorHAnsi"/>
-          <w:color w:val="333333"/>
-          <w:shd w:val="clear" w:color="auto" w:fill="FFFFFF"/>
-        </w:rPr>
-        <w:t xml:space="preserve"> is the primitive type</w:t>
+        <w:t>byte is the primitive type</w:t>
       </w:r>
     </w:p>
     <w:p>
@@ -12516,7 +12588,7 @@
       <w:tr>
         <w:tc>
           <w:tcPr>
-            <w:tcW w:w="10790" w:type="dxa"/>
+            <w:tcW w:w="10430" w:type="dxa"/>
           </w:tcPr>
           <w:p>
             <w:pPr>
@@ -12576,12 +12648,887 @@
           <w:ilvl w:val="0"/>
           <w:numId w:val="0"/>
         </w:numPr>
+      </w:pPr>
+      <w:bookmarkStart w:id="17" w:name="_Toc187427038"/>
+      <w:bookmarkStart w:id="18" w:name="_Toc235381883"/>
+      <w:bookmarkStart w:id="19" w:name="_Toc235526056"/>
+      <w:r>
+        <w:lastRenderedPageBreak/>
+        <w:t>Type Casting in Java</w:t>
+      </w:r>
+      <w:bookmarkEnd w:id="18"/>
+      <w:bookmarkEnd w:id="19"/>
+    </w:p>
+    <w:p>
+      <w:pPr>
+        <w:spacing w:after="0" w:line="240" w:lineRule="auto"/>
+        <w:contextualSpacing/>
+        <w:jc w:val="both"/>
+      </w:pPr>
+      <w:r>
+        <w:t>In Java, type casting is a method or process that converts a data type into another data type in both ways manually and automatically. The automatic conversion is done by the compiler and manual conversion is performed by the programmer. In this section, we will discuss type casting and its types with proper examples.</w:t>
+      </w:r>
+    </w:p>
+    <w:p>
+      <w:pPr>
+        <w:spacing w:after="0" w:line="240" w:lineRule="auto"/>
+        <w:contextualSpacing/>
+      </w:pPr>
+      <w:r>
+        <w:t>Converting a value from one data type to another data type is known as type casting. </w:t>
+      </w:r>
+    </w:p>
+    <w:p>
+      <w:pPr>
+        <w:spacing w:after="0" w:line="240" w:lineRule="auto"/>
+        <w:contextualSpacing/>
+        <w:jc w:val="both"/>
+      </w:pPr>
+    </w:p>
+    <w:tbl>
+      <w:tblPr>
+        <w:tblStyle w:val="TableGrid"/>
+        <w:tblW w:w="0" w:type="auto"/>
+        <w:tblLook w:val="04A0" w:firstRow="1" w:lastRow="0" w:firstColumn="1" w:lastColumn="0" w:noHBand="0" w:noVBand="1"/>
+      </w:tblPr>
+      <w:tblGrid>
+        <w:gridCol w:w="6835"/>
+        <w:gridCol w:w="3955"/>
+      </w:tblGrid>
+      <w:tr>
+        <w:tc>
+          <w:tcPr>
+            <w:tcW w:w="6835" w:type="dxa"/>
+          </w:tcPr>
+          <w:p>
+            <w:pPr>
+              <w:contextualSpacing/>
+              <w:jc w:val="both"/>
+            </w:pPr>
+            <w:r>
+              <w:rPr>
+                <w:noProof/>
+              </w:rPr>
+              <w:drawing>
+                <wp:inline distT="0" distB="0" distL="0" distR="0" wp14:anchorId="1EC67E44" wp14:editId="3FE6B378">
+                  <wp:extent cx="4126727" cy="1017270"/>
+                  <wp:effectExtent l="0" t="0" r="0" b="0"/>
+                  <wp:docPr id="1257833755" name="Picture 4" descr="Type Casting in Java"/>
+                  <wp:cNvGraphicFramePr>
+                    <a:graphicFrameLocks xmlns:a="http://schemas.openxmlformats.org/drawingml/2006/main" noChangeAspect="1"/>
+                  </wp:cNvGraphicFramePr>
+                  <a:graphic xmlns:a="http://schemas.openxmlformats.org/drawingml/2006/main">
+                    <a:graphicData uri="http://schemas.openxmlformats.org/drawingml/2006/picture">
+                      <pic:pic xmlns:pic="http://schemas.openxmlformats.org/drawingml/2006/picture">
+                        <pic:nvPicPr>
+                          <pic:cNvPr id="0" name="Picture 2" descr="Type Casting in Java"/>
+                          <pic:cNvPicPr>
+                            <a:picLocks noChangeAspect="1" noChangeArrowheads="1"/>
+                          </pic:cNvPicPr>
+                        </pic:nvPicPr>
+                        <pic:blipFill>
+                          <a:blip r:embed="rId36">
+                            <a:extLst>
+                              <a:ext uri="{28A0092B-C50C-407E-A947-70E740481C1C}">
+                                <a14:useLocalDpi xmlns:a14="http://schemas.microsoft.com/office/drawing/2010/main" val="0"/>
+                              </a:ext>
+                            </a:extLst>
+                          </a:blip>
+                          <a:srcRect/>
+                          <a:stretch>
+                            <a:fillRect/>
+                          </a:stretch>
+                        </pic:blipFill>
+                        <pic:spPr bwMode="auto">
+                          <a:xfrm>
+                            <a:off x="0" y="0"/>
+                            <a:ext cx="4191647" cy="1033273"/>
+                          </a:xfrm>
+                          <a:prstGeom prst="rect">
+                            <a:avLst/>
+                          </a:prstGeom>
+                          <a:noFill/>
+                          <a:ln>
+                            <a:noFill/>
+                          </a:ln>
+                        </pic:spPr>
+                      </pic:pic>
+                    </a:graphicData>
+                  </a:graphic>
+                </wp:inline>
+              </w:drawing>
+            </w:r>
+          </w:p>
+        </w:tc>
+        <w:tc>
+          <w:tcPr>
+            <w:tcW w:w="3955" w:type="dxa"/>
+          </w:tcPr>
+          <w:p>
+            <w:pPr>
+              <w:contextualSpacing/>
+            </w:pPr>
+            <w:r>
+              <w:t>Types of Type Casting</w:t>
+            </w:r>
+          </w:p>
+          <w:p>
+            <w:pPr>
+              <w:contextualSpacing/>
+            </w:pPr>
+            <w:r>
+              <w:t>There are two types of type casting:</w:t>
+            </w:r>
+          </w:p>
+          <w:p>
+            <w:pPr>
+              <w:contextualSpacing/>
+            </w:pPr>
+            <w:r>
+              <w:t>1. Widening Type Casting</w:t>
+            </w:r>
+          </w:p>
+          <w:p>
+            <w:pPr>
+              <w:contextualSpacing/>
+            </w:pPr>
+            <w:r>
+              <w:t>2. Narrowing Type Casting</w:t>
+            </w:r>
+          </w:p>
+          <w:p>
+            <w:pPr>
+              <w:contextualSpacing/>
+              <w:jc w:val="both"/>
+            </w:pPr>
+          </w:p>
+        </w:tc>
+      </w:tr>
+    </w:tbl>
+    <w:p>
+      <w:pPr>
+        <w:spacing w:after="0" w:line="240" w:lineRule="auto"/>
+        <w:contextualSpacing/>
+        <w:jc w:val="both"/>
+      </w:pPr>
+    </w:p>
+    <w:p>
+      <w:pPr>
+        <w:pStyle w:val="Heading2"/>
+      </w:pPr>
+      <w:bookmarkStart w:id="20" w:name="_Toc235526057"/>
+      <w:r>
+        <w:t>Widening Type Casting</w:t>
+      </w:r>
+      <w:bookmarkEnd w:id="20"/>
+    </w:p>
+    <w:p>
+      <w:pPr>
+        <w:spacing w:after="0" w:line="240" w:lineRule="auto"/>
+        <w:contextualSpacing/>
+      </w:pPr>
+      <w:r>
+        <w:t>Converting a lower data type into a higher one is called widening type casting. It is also known as implicit conversion or casting down. It is done automatically. It is safe because there is no chance to lose data. It takes place when:</w:t>
+      </w:r>
+    </w:p>
+    <w:p>
+      <w:pPr>
+        <w:pStyle w:val="ListParagraph"/>
+        <w:numPr>
+          <w:ilvl w:val="0"/>
+          <w:numId w:val="35"/>
+        </w:numPr>
+        <w:spacing w:after="0" w:line="240" w:lineRule="auto"/>
+      </w:pPr>
+      <w:r>
+        <w:t>Both data types must be compatible with each other.</w:t>
+      </w:r>
+    </w:p>
+    <w:p>
+      <w:pPr>
+        <w:pStyle w:val="ListParagraph"/>
+        <w:numPr>
+          <w:ilvl w:val="0"/>
+          <w:numId w:val="35"/>
+        </w:numPr>
+        <w:spacing w:after="0" w:line="240" w:lineRule="auto"/>
+      </w:pPr>
+      <w:r>
+        <w:t>The target type must be larger than the source type</w:t>
+      </w:r>
+    </w:p>
+    <w:tbl>
+      <w:tblPr>
+        <w:tblW w:w="6173" w:type="dxa"/>
+        <w:tblLook w:val="04A0" w:firstRow="1" w:lastRow="0" w:firstColumn="1" w:lastColumn="0" w:noHBand="0" w:noVBand="1"/>
+      </w:tblPr>
+      <w:tblGrid>
+        <w:gridCol w:w="6173"/>
+      </w:tblGrid>
+      <w:tr>
+        <w:trPr>
+          <w:trHeight w:val="290"/>
+        </w:trPr>
+        <w:tc>
+          <w:tcPr>
+            <w:tcW w:w="0" w:type="auto"/>
+            <w:tcBorders>
+              <w:top w:val="single" w:sz="6" w:space="0" w:color="DEE2E6"/>
+              <w:left w:val="single" w:sz="6" w:space="0" w:color="DEE2E6"/>
+              <w:bottom w:val="single" w:sz="6" w:space="0" w:color="DEE2E6"/>
+              <w:right w:val="single" w:sz="6" w:space="0" w:color="DEE2E6"/>
+            </w:tcBorders>
+            <w:tcMar>
+              <w:top w:w="15" w:type="dxa"/>
+              <w:left w:w="15" w:type="dxa"/>
+              <w:bottom w:w="15" w:type="dxa"/>
+              <w:right w:w="15" w:type="dxa"/>
+            </w:tcMar>
+            <w:hideMark/>
+          </w:tcPr>
+          <w:p>
+            <w:pPr>
+              <w:spacing w:after="0" w:line="240" w:lineRule="auto"/>
+              <w:ind w:left="360"/>
+            </w:pPr>
+            <w:r>
+              <w:rPr>
+                <w:b/>
+                <w:bCs/>
+              </w:rPr>
+              <w:t>byte -&gt; short -&gt; char -&gt; int -&gt; long -&gt; float -&gt; double </w:t>
+            </w:r>
+          </w:p>
+        </w:tc>
+      </w:tr>
+    </w:tbl>
+    <w:p>
+      <w:r>
+        <w:t>For example, the conversion between numeric data types to char or Boolean is not done automatically. Also, the char and Boolean data types are not compatible with each other. Let’s see an example.</w:t>
+      </w:r>
+    </w:p>
+    <w:tbl>
+      <w:tblPr>
+        <w:tblW w:w="10252" w:type="dxa"/>
+        <w:tblLook w:val="04A0" w:firstRow="1" w:lastRow="0" w:firstColumn="1" w:lastColumn="0" w:noHBand="0" w:noVBand="1"/>
+      </w:tblPr>
+      <w:tblGrid>
+        <w:gridCol w:w="10252"/>
+      </w:tblGrid>
+      <w:tr>
+        <w:trPr>
+          <w:trHeight w:val="1170"/>
+        </w:trPr>
+        <w:tc>
+          <w:tcPr>
+            <w:tcW w:w="10252" w:type="dxa"/>
+            <w:tcBorders>
+              <w:top w:val="single" w:sz="6" w:space="0" w:color="DEE2E6"/>
+              <w:left w:val="single" w:sz="6" w:space="0" w:color="DEE2E6"/>
+              <w:bottom w:val="single" w:sz="6" w:space="0" w:color="DEE2E6"/>
+              <w:right w:val="single" w:sz="6" w:space="0" w:color="DEE2E6"/>
+            </w:tcBorders>
+            <w:tcMar>
+              <w:top w:w="15" w:type="dxa"/>
+              <w:left w:w="15" w:type="dxa"/>
+              <w:bottom w:w="15" w:type="dxa"/>
+              <w:right w:w="15" w:type="dxa"/>
+            </w:tcMar>
+            <w:hideMark/>
+          </w:tcPr>
+          <w:p>
+            <w:pPr>
+              <w:rPr>
+                <w:sz w:val="22"/>
+                <w:szCs w:val="22"/>
+              </w:rPr>
+            </w:pPr>
+            <w:r>
+              <w:rPr>
+                <w:sz w:val="22"/>
+                <w:szCs w:val="22"/>
+              </w:rPr>
+              <w:t xml:space="preserve">public class </w:t>
+            </w:r>
+            <w:proofErr w:type="spellStart"/>
+            <w:r>
+              <w:rPr>
+                <w:sz w:val="22"/>
+                <w:szCs w:val="22"/>
+              </w:rPr>
+              <w:t>WideningTypeCastingExample</w:t>
+            </w:r>
+            <w:proofErr w:type="spellEnd"/>
+            <w:r>
+              <w:rPr>
+                <w:sz w:val="22"/>
+                <w:szCs w:val="22"/>
+              </w:rPr>
+              <w:t> </w:t>
+            </w:r>
+            <w:r>
+              <w:rPr>
+                <w:sz w:val="22"/>
+                <w:szCs w:val="22"/>
+              </w:rPr>
+              <w:br/>
+              <w:t>{  </w:t>
+            </w:r>
+            <w:r>
+              <w:rPr>
+                <w:sz w:val="22"/>
+                <w:szCs w:val="22"/>
+              </w:rPr>
+              <w:br/>
+              <w:t xml:space="preserve">    public static void main(String[] </w:t>
+            </w:r>
+            <w:proofErr w:type="spellStart"/>
+            <w:r>
+              <w:rPr>
+                <w:sz w:val="22"/>
+                <w:szCs w:val="22"/>
+              </w:rPr>
+              <w:t>args</w:t>
+            </w:r>
+            <w:proofErr w:type="spellEnd"/>
+            <w:r>
+              <w:rPr>
+                <w:sz w:val="22"/>
+                <w:szCs w:val="22"/>
+              </w:rPr>
+              <w:t>)  {  </w:t>
+            </w:r>
+            <w:r>
+              <w:rPr>
+                <w:sz w:val="22"/>
+                <w:szCs w:val="22"/>
+              </w:rPr>
+              <w:br/>
+              <w:t xml:space="preserve">       int x = 7;  //automatically converts the integer type into long type   </w:t>
+            </w:r>
+            <w:r>
+              <w:rPr>
+                <w:sz w:val="22"/>
+                <w:szCs w:val="22"/>
+              </w:rPr>
+              <w:br/>
+              <w:t xml:space="preserve">       long y = x;  //automatically converts the long type into float type  </w:t>
+            </w:r>
+            <w:r>
+              <w:rPr>
+                <w:sz w:val="22"/>
+                <w:szCs w:val="22"/>
+              </w:rPr>
+              <w:br/>
+              <w:t xml:space="preserve">       float z = y;  </w:t>
+            </w:r>
+            <w:r>
+              <w:rPr>
+                <w:sz w:val="22"/>
+                <w:szCs w:val="22"/>
+              </w:rPr>
+              <w:br/>
+              <w:t xml:space="preserve">       </w:t>
+            </w:r>
+            <w:proofErr w:type="spellStart"/>
+            <w:r>
+              <w:rPr>
+                <w:sz w:val="22"/>
+                <w:szCs w:val="22"/>
+              </w:rPr>
+              <w:t>System.out.println</w:t>
+            </w:r>
+            <w:proofErr w:type="spellEnd"/>
+            <w:r>
+              <w:rPr>
+                <w:sz w:val="22"/>
+                <w:szCs w:val="22"/>
+              </w:rPr>
+              <w:t>(“Before conversion, int value “+x); </w:t>
+            </w:r>
+            <w:r>
+              <w:rPr>
+                <w:sz w:val="22"/>
+                <w:szCs w:val="22"/>
+              </w:rPr>
+              <w:br/>
+              <w:t xml:space="preserve">      </w:t>
+            </w:r>
+            <w:proofErr w:type="spellStart"/>
+            <w:r>
+              <w:rPr>
+                <w:sz w:val="22"/>
+                <w:szCs w:val="22"/>
+              </w:rPr>
+              <w:t>System.out.println</w:t>
+            </w:r>
+            <w:proofErr w:type="spellEnd"/>
+            <w:r>
+              <w:rPr>
+                <w:sz w:val="22"/>
+                <w:szCs w:val="22"/>
+              </w:rPr>
+              <w:t>(“After conversion, long value “+y);  </w:t>
+            </w:r>
+            <w:r>
+              <w:rPr>
+                <w:sz w:val="22"/>
+                <w:szCs w:val="22"/>
+              </w:rPr>
+              <w:br/>
+              <w:t xml:space="preserve">      </w:t>
+            </w:r>
+            <w:proofErr w:type="spellStart"/>
+            <w:r>
+              <w:rPr>
+                <w:sz w:val="22"/>
+                <w:szCs w:val="22"/>
+              </w:rPr>
+              <w:t>System.out.println</w:t>
+            </w:r>
+            <w:proofErr w:type="spellEnd"/>
+            <w:r>
+              <w:rPr>
+                <w:sz w:val="22"/>
+                <w:szCs w:val="22"/>
+              </w:rPr>
+              <w:t>(“After conversion, float value “+z); </w:t>
+            </w:r>
+            <w:r>
+              <w:rPr>
+                <w:sz w:val="22"/>
+                <w:szCs w:val="22"/>
+              </w:rPr>
+              <w:br/>
+              <w:t>   } </w:t>
+            </w:r>
+            <w:r>
+              <w:rPr>
+                <w:sz w:val="22"/>
+                <w:szCs w:val="22"/>
+              </w:rPr>
+              <w:br/>
+              <w:t>}   </w:t>
+            </w:r>
+          </w:p>
+        </w:tc>
+      </w:tr>
+    </w:tbl>
+    <w:p>
+      <w:r>
+        <w:t>Output:</w:t>
+      </w:r>
+    </w:p>
+    <w:tbl>
+      <w:tblPr>
+        <w:tblW w:w="10098" w:type="dxa"/>
+        <w:tblLook w:val="04A0" w:firstRow="1" w:lastRow="0" w:firstColumn="1" w:lastColumn="0" w:noHBand="0" w:noVBand="1"/>
+      </w:tblPr>
+      <w:tblGrid>
+        <w:gridCol w:w="10098"/>
+      </w:tblGrid>
+      <w:tr>
+        <w:trPr>
+          <w:trHeight w:val="21"/>
+        </w:trPr>
+        <w:tc>
+          <w:tcPr>
+            <w:tcW w:w="0" w:type="auto"/>
+            <w:tcBorders>
+              <w:top w:val="single" w:sz="6" w:space="0" w:color="DEE2E6"/>
+              <w:left w:val="single" w:sz="6" w:space="0" w:color="DEE2E6"/>
+              <w:bottom w:val="single" w:sz="6" w:space="0" w:color="DEE2E6"/>
+              <w:right w:val="single" w:sz="6" w:space="0" w:color="DEE2E6"/>
+            </w:tcBorders>
+            <w:tcMar>
+              <w:top w:w="15" w:type="dxa"/>
+              <w:left w:w="15" w:type="dxa"/>
+              <w:bottom w:w="15" w:type="dxa"/>
+              <w:right w:w="15" w:type="dxa"/>
+            </w:tcMar>
+            <w:hideMark/>
+          </w:tcPr>
+          <w:p>
+            <w:pPr>
+              <w:rPr>
+                <w:sz w:val="22"/>
+                <w:szCs w:val="22"/>
+              </w:rPr>
+            </w:pPr>
+            <w:r>
+              <w:rPr>
+                <w:sz w:val="22"/>
+                <w:szCs w:val="22"/>
+              </w:rPr>
+              <w:t>Before conversion, the value is: 7After conversion, the long value is: 7After conversion, the float value is: 7.0</w:t>
+            </w:r>
+          </w:p>
+        </w:tc>
+      </w:tr>
+    </w:tbl>
+    <w:p>
+      <w:pPr>
+        <w:pStyle w:val="Heading2"/>
+      </w:pPr>
+      <w:bookmarkStart w:id="21" w:name="_Toc235526058"/>
+      <w:r>
+        <w:lastRenderedPageBreak/>
+        <w:t>Narrowing Type Castin</w:t>
+      </w:r>
+      <w:r>
+        <w:t>g</w:t>
+      </w:r>
+      <w:bookmarkEnd w:id="21"/>
+    </w:p>
+    <w:p>
+      <w:r>
+        <w:t>Converting a higher data type into a lower one is called narrowing type casting. It is also known as explicit conversion or casting up. It is done manually by the programmer. If we do not perform casting then the compiler reports a compile-time error.</w:t>
+      </w:r>
+    </w:p>
+    <w:tbl>
+      <w:tblPr>
+        <w:tblW w:w="14100" w:type="dxa"/>
+        <w:tblLook w:val="04A0" w:firstRow="1" w:lastRow="0" w:firstColumn="1" w:lastColumn="0" w:noHBand="0" w:noVBand="1"/>
+      </w:tblPr>
+      <w:tblGrid>
+        <w:gridCol w:w="14100"/>
+      </w:tblGrid>
+      <w:tr>
+        <w:tc>
+          <w:tcPr>
+            <w:tcW w:w="0" w:type="auto"/>
+            <w:tcBorders>
+              <w:top w:val="single" w:sz="6" w:space="0" w:color="DEE2E6"/>
+              <w:left w:val="single" w:sz="6" w:space="0" w:color="DEE2E6"/>
+              <w:bottom w:val="single" w:sz="6" w:space="0" w:color="DEE2E6"/>
+              <w:right w:val="single" w:sz="6" w:space="0" w:color="DEE2E6"/>
+            </w:tcBorders>
+            <w:tcMar>
+              <w:top w:w="15" w:type="dxa"/>
+              <w:left w:w="15" w:type="dxa"/>
+              <w:bottom w:w="15" w:type="dxa"/>
+              <w:right w:w="15" w:type="dxa"/>
+            </w:tcMar>
+            <w:hideMark/>
+          </w:tcPr>
+          <w:p>
+            <w:r>
+              <w:rPr>
+                <w:b/>
+                <w:bCs/>
+              </w:rPr>
+              <w:t>double -&gt; float -&gt; long -&gt; int -&gt; char -&gt; short -&gt; byte </w:t>
+            </w:r>
+          </w:p>
+        </w:tc>
+      </w:tr>
+    </w:tbl>
+    <w:p>
+      <w:r>
+        <w:t>Let’s see an example of narrowing type casting.</w:t>
+      </w:r>
+    </w:p>
+    <w:p>
+      <w:r>
+        <w:t>In the following example, we performed the narrowing type casting two times. First, we have converted the double type into a long data type after that long data type is converted into an int type.</w:t>
+      </w:r>
+    </w:p>
+    <w:tbl>
+      <w:tblPr>
+        <w:tblW w:w="10162" w:type="dxa"/>
+        <w:tblLook w:val="04A0" w:firstRow="1" w:lastRow="0" w:firstColumn="1" w:lastColumn="0" w:noHBand="0" w:noVBand="1"/>
+      </w:tblPr>
+      <w:tblGrid>
+        <w:gridCol w:w="10162"/>
+      </w:tblGrid>
+      <w:tr>
+        <w:trPr>
+          <w:trHeight w:val="1675"/>
+        </w:trPr>
+        <w:tc>
+          <w:tcPr>
+            <w:tcW w:w="10162" w:type="dxa"/>
+            <w:tcBorders>
+              <w:top w:val="single" w:sz="6" w:space="0" w:color="DEE2E6"/>
+              <w:left w:val="single" w:sz="6" w:space="0" w:color="DEE2E6"/>
+              <w:bottom w:val="single" w:sz="6" w:space="0" w:color="DEE2E6"/>
+              <w:right w:val="single" w:sz="6" w:space="0" w:color="DEE2E6"/>
+            </w:tcBorders>
+            <w:tcMar>
+              <w:top w:w="15" w:type="dxa"/>
+              <w:left w:w="15" w:type="dxa"/>
+              <w:bottom w:w="15" w:type="dxa"/>
+              <w:right w:w="15" w:type="dxa"/>
+            </w:tcMar>
+            <w:hideMark/>
+          </w:tcPr>
+          <w:p>
+            <w:r>
+              <w:t>public class </w:t>
+            </w:r>
+            <w:proofErr w:type="spellStart"/>
+            <w:r>
+              <w:t>NarrowingTypeCastingExample</w:t>
+            </w:r>
+            <w:proofErr w:type="spellEnd"/>
+            <w:r>
+              <w:t>  {  </w:t>
+            </w:r>
+            <w:r>
+              <w:br/>
+              <w:t xml:space="preserve">       </w:t>
+            </w:r>
+            <w:r>
+              <w:t xml:space="preserve">public static void main(String </w:t>
+            </w:r>
+            <w:proofErr w:type="spellStart"/>
+            <w:r>
+              <w:t>args</w:t>
+            </w:r>
+            <w:proofErr w:type="spellEnd"/>
+            <w:r>
+              <w:t>[])  { </w:t>
+            </w:r>
+            <w:r>
+              <w:br/>
+              <w:t xml:space="preserve">            </w:t>
+            </w:r>
+            <w:r>
+              <w:t>double d = 166.66;  </w:t>
+            </w:r>
+            <w:r>
+              <w:t xml:space="preserve"> </w:t>
+            </w:r>
+            <w:r>
+              <w:t>//converting double data type into long data type </w:t>
+            </w:r>
+            <w:r>
+              <w:br/>
+              <w:t xml:space="preserve">            </w:t>
+            </w:r>
+            <w:r>
+              <w:t>long l = (long)d; </w:t>
+            </w:r>
+            <w:r>
+              <w:t xml:space="preserve">        </w:t>
+            </w:r>
+            <w:r>
+              <w:t>//converting long data type into int data type  </w:t>
+            </w:r>
+            <w:r>
+              <w:br/>
+              <w:t xml:space="preserve">            </w:t>
+            </w:r>
+            <w:r>
+              <w:t>int </w:t>
+            </w:r>
+            <w:proofErr w:type="spellStart"/>
+            <w:r>
+              <w:t>i</w:t>
+            </w:r>
+            <w:proofErr w:type="spellEnd"/>
+            <w:r>
+              <w:t xml:space="preserve"> = (int)l;  </w:t>
+            </w:r>
+            <w:r>
+              <w:br/>
+              <w:t xml:space="preserve">            </w:t>
+            </w:r>
+            <w:proofErr w:type="spellStart"/>
+            <w:r>
+              <w:t>System.out.println</w:t>
+            </w:r>
+            <w:proofErr w:type="spellEnd"/>
+            <w:r>
+              <w:t>(“Before conversion: “+d);  </w:t>
+            </w:r>
+            <w:r>
+              <w:t xml:space="preserve"> </w:t>
+            </w:r>
+            <w:r>
+              <w:t>//fractional part lost  </w:t>
+            </w:r>
+            <w:r>
+              <w:br/>
+              <w:t xml:space="preserve">           </w:t>
+            </w:r>
+            <w:proofErr w:type="spellStart"/>
+            <w:r>
+              <w:t>System.out.println</w:t>
+            </w:r>
+            <w:proofErr w:type="spellEnd"/>
+            <w:r>
+              <w:t>(“After conversion into long type: “+l); </w:t>
+            </w:r>
+            <w:r>
+              <w:t xml:space="preserve"> </w:t>
+            </w:r>
+            <w:r>
+              <w:t>//fractional part lost  </w:t>
+            </w:r>
+            <w:r>
+              <w:br/>
+              <w:t xml:space="preserve">           </w:t>
+            </w:r>
+            <w:proofErr w:type="spellStart"/>
+            <w:r>
+              <w:t>System.out.println</w:t>
+            </w:r>
+            <w:proofErr w:type="spellEnd"/>
+            <w:r>
+              <w:t>(“After conversion into int type: “+</w:t>
+            </w:r>
+            <w:proofErr w:type="spellStart"/>
+            <w:r>
+              <w:t>i</w:t>
+            </w:r>
+            <w:proofErr w:type="spellEnd"/>
+            <w:r>
+              <w:t>);  </w:t>
+            </w:r>
+            <w:r>
+              <w:br/>
+              <w:t xml:space="preserve">       </w:t>
+            </w:r>
+            <w:r>
+              <w:t>}  </w:t>
+            </w:r>
+            <w:r>
+              <w:br/>
+            </w:r>
+            <w:r>
+              <w:t>}</w:t>
+            </w:r>
+            <w:r>
+              <w:rPr>
+                <w:b/>
+                <w:bCs/>
+              </w:rPr>
+              <w:t>   </w:t>
+            </w:r>
+          </w:p>
+        </w:tc>
+      </w:tr>
+    </w:tbl>
+    <w:p>
+      <w:r>
+        <w:rPr>
+          <w:b/>
+          <w:bCs/>
+        </w:rPr>
+        <w:t>Output:</w:t>
+      </w:r>
+    </w:p>
+    <w:tbl>
+      <w:tblPr>
+        <w:tblW w:w="10155" w:type="dxa"/>
+        <w:tblLook w:val="04A0" w:firstRow="1" w:lastRow="0" w:firstColumn="1" w:lastColumn="0" w:noHBand="0" w:noVBand="1"/>
+      </w:tblPr>
+      <w:tblGrid>
+        <w:gridCol w:w="10155"/>
+      </w:tblGrid>
+      <w:tr>
+        <w:trPr>
+          <w:trHeight w:val="398"/>
+        </w:trPr>
+        <w:tc>
+          <w:tcPr>
+            <w:tcW w:w="0" w:type="auto"/>
+            <w:tcBorders>
+              <w:top w:val="single" w:sz="6" w:space="0" w:color="DEE2E6"/>
+              <w:left w:val="single" w:sz="6" w:space="0" w:color="DEE2E6"/>
+              <w:bottom w:val="single" w:sz="6" w:space="0" w:color="DEE2E6"/>
+              <w:right w:val="single" w:sz="6" w:space="0" w:color="DEE2E6"/>
+            </w:tcBorders>
+            <w:tcMar>
+              <w:top w:w="15" w:type="dxa"/>
+              <w:left w:w="15" w:type="dxa"/>
+              <w:bottom w:w="15" w:type="dxa"/>
+              <w:right w:w="15" w:type="dxa"/>
+            </w:tcMar>
+            <w:hideMark/>
+          </w:tcPr>
+          <w:p>
+            <w:r>
+              <w:t>Before conversion: 166.66</w:t>
+            </w:r>
+            <w:r>
+              <w:br/>
+            </w:r>
+            <w:r>
+              <w:t>After conversion into long type: 166</w:t>
+            </w:r>
+            <w:r>
+              <w:br/>
+            </w:r>
+            <w:r>
+              <w:t>After conversion into int type: 166</w:t>
+            </w:r>
+          </w:p>
+        </w:tc>
+      </w:tr>
+    </w:tbl>
+    <w:p>
+      <w:pPr>
         <w:rPr>
           <w:lang w:eastAsia="en-US"/>
         </w:rPr>
       </w:pPr>
-      <w:bookmarkStart w:id="17" w:name="_Toc187427038"/>
-      <w:bookmarkStart w:id="18" w:name="_Toc235304553"/>
+    </w:p>
+    <w:p>
+      <w:pPr>
+        <w:rPr>
+          <w:lang w:eastAsia="en-US"/>
+        </w:rPr>
+      </w:pPr>
+    </w:p>
+    <w:p>
+      <w:pPr>
+        <w:rPr>
+          <w:lang w:eastAsia="en-US"/>
+        </w:rPr>
+      </w:pPr>
+    </w:p>
+    <w:p>
+      <w:pPr>
+        <w:rPr>
+          <w:lang w:eastAsia="en-US"/>
+        </w:rPr>
+      </w:pPr>
+    </w:p>
+    <w:p>
+      <w:pPr>
+        <w:rPr>
+          <w:lang w:eastAsia="en-US"/>
+        </w:rPr>
+      </w:pPr>
+    </w:p>
+    <w:p>
+      <w:pPr>
+        <w:rPr>
+          <w:lang w:eastAsia="en-US"/>
+        </w:rPr>
+      </w:pPr>
+    </w:p>
+    <w:p>
+      <w:pPr>
+        <w:rPr>
+          <w:lang w:eastAsia="en-US"/>
+        </w:rPr>
+      </w:pPr>
+    </w:p>
+    <w:p>
+      <w:pPr>
+        <w:pStyle w:val="Heading1"/>
+        <w:numPr>
+          <w:ilvl w:val="0"/>
+          <w:numId w:val="0"/>
+        </w:numPr>
+        <w:rPr>
+          <w:lang w:eastAsia="en-US"/>
+        </w:rPr>
+      </w:pPr>
+      <w:bookmarkStart w:id="22" w:name="_Toc235526059"/>
       <w:r>
         <w:rPr>
           <w:lang w:eastAsia="en-US"/>
@@ -12599,7 +13546,7 @@
       <w:r>
         <w:t>Hexa-decimal number (Base-16)</w:t>
       </w:r>
-      <w:bookmarkEnd w:id="18"/>
+      <w:bookmarkEnd w:id="22"/>
     </w:p>
     <w:p>
       <w:pPr>
@@ -13210,7 +14157,7 @@
                     <pic:cNvPicPr/>
                   </pic:nvPicPr>
                   <pic:blipFill>
-                    <a:blip r:embed="rId36"/>
+                    <a:blip r:embed="rId37"/>
                     <a:stretch>
                       <a:fillRect/>
                     </a:stretch>
@@ -13235,17 +14182,17 @@
       <w:pPr>
         <w:pStyle w:val="Heading2"/>
       </w:pPr>
-      <w:bookmarkStart w:id="19" w:name="_Toc187427042"/>
-      <w:bookmarkStart w:id="20" w:name="_Toc235304554"/>
+      <w:bookmarkStart w:id="23" w:name="_Toc187427042"/>
+      <w:bookmarkStart w:id="24" w:name="_Toc235526060"/>
       <w:r>
         <w:lastRenderedPageBreak/>
         <w:t xml:space="preserve">Conversion between number </w:t>
       </w:r>
-      <w:bookmarkEnd w:id="19"/>
+      <w:bookmarkEnd w:id="23"/>
       <w:r>
         <w:t>systems</w:t>
       </w:r>
-      <w:bookmarkEnd w:id="20"/>
+      <w:bookmarkEnd w:id="24"/>
       <w:r>
         <w:t xml:space="preserve"> </w:t>
       </w:r>
@@ -15911,8 +16858,8 @@
       </w:pPr>
     </w:p>
     <w:sectPr>
-      <w:headerReference w:type="default" r:id="rId37"/>
-      <w:footerReference w:type="default" r:id="rId38"/>
+      <w:headerReference w:type="default" r:id="rId38"/>
+      <w:footerReference w:type="default" r:id="rId39"/>
       <w:pgSz w:w="12240" w:h="15840"/>
       <w:pgMar w:top="0" w:right="720" w:bottom="720" w:left="720" w:header="720" w:footer="720" w:gutter="0"/>
       <w:cols w:space="720"/>
@@ -19645,6 +20592,118 @@
     </w:lvl>
   </w:abstractNum>
   <w:abstractNum w:abstractNumId="26" w15:restartNumberingAfterBreak="0">
+    <w:nsid w:val="559D1FF0"/>
+    <w:multiLevelType w:val="hybridMultilevel"/>
+    <w:tmpl w:val="039E1012"/>
+    <w:lvl w:ilvl="0" w:tplc="CFD25DB2">
+      <w:numFmt w:val="bullet"/>
+      <w:lvlText w:val=""/>
+      <w:lvlJc w:val="left"/>
+      <w:pPr>
+        <w:ind w:left="1080" w:hanging="360"/>
+      </w:pPr>
+      <w:rPr>
+        <w:rFonts w:ascii="Symbol" w:eastAsiaTheme="minorEastAsia" w:hAnsi="Symbol" w:cstheme="minorBidi" w:hint="default"/>
+      </w:rPr>
+    </w:lvl>
+    <w:lvl w:ilvl="1" w:tplc="04090003" w:tentative="1">
+      <w:start w:val="1"/>
+      <w:numFmt w:val="bullet"/>
+      <w:lvlText w:val="o"/>
+      <w:lvlJc w:val="left"/>
+      <w:pPr>
+        <w:ind w:left="1800" w:hanging="360"/>
+      </w:pPr>
+      <w:rPr>
+        <w:rFonts w:ascii="Courier New" w:hAnsi="Courier New" w:cs="Courier New" w:hint="default"/>
+      </w:rPr>
+    </w:lvl>
+    <w:lvl w:ilvl="2" w:tplc="04090005" w:tentative="1">
+      <w:start w:val="1"/>
+      <w:numFmt w:val="bullet"/>
+      <w:lvlText w:val=""/>
+      <w:lvlJc w:val="left"/>
+      <w:pPr>
+        <w:ind w:left="2520" w:hanging="360"/>
+      </w:pPr>
+      <w:rPr>
+        <w:rFonts w:ascii="Wingdings" w:hAnsi="Wingdings" w:hint="default"/>
+      </w:rPr>
+    </w:lvl>
+    <w:lvl w:ilvl="3" w:tplc="04090001" w:tentative="1">
+      <w:start w:val="1"/>
+      <w:numFmt w:val="bullet"/>
+      <w:lvlText w:val=""/>
+      <w:lvlJc w:val="left"/>
+      <w:pPr>
+        <w:ind w:left="3240" w:hanging="360"/>
+      </w:pPr>
+      <w:rPr>
+        <w:rFonts w:ascii="Symbol" w:hAnsi="Symbol" w:hint="default"/>
+      </w:rPr>
+    </w:lvl>
+    <w:lvl w:ilvl="4" w:tplc="04090003" w:tentative="1">
+      <w:start w:val="1"/>
+      <w:numFmt w:val="bullet"/>
+      <w:lvlText w:val="o"/>
+      <w:lvlJc w:val="left"/>
+      <w:pPr>
+        <w:ind w:left="3960" w:hanging="360"/>
+      </w:pPr>
+      <w:rPr>
+        <w:rFonts w:ascii="Courier New" w:hAnsi="Courier New" w:cs="Courier New" w:hint="default"/>
+      </w:rPr>
+    </w:lvl>
+    <w:lvl w:ilvl="5" w:tplc="04090005" w:tentative="1">
+      <w:start w:val="1"/>
+      <w:numFmt w:val="bullet"/>
+      <w:lvlText w:val=""/>
+      <w:lvlJc w:val="left"/>
+      <w:pPr>
+        <w:ind w:left="4680" w:hanging="360"/>
+      </w:pPr>
+      <w:rPr>
+        <w:rFonts w:ascii="Wingdings" w:hAnsi="Wingdings" w:hint="default"/>
+      </w:rPr>
+    </w:lvl>
+    <w:lvl w:ilvl="6" w:tplc="04090001" w:tentative="1">
+      <w:start w:val="1"/>
+      <w:numFmt w:val="bullet"/>
+      <w:lvlText w:val=""/>
+      <w:lvlJc w:val="left"/>
+      <w:pPr>
+        <w:ind w:left="5400" w:hanging="360"/>
+      </w:pPr>
+      <w:rPr>
+        <w:rFonts w:ascii="Symbol" w:hAnsi="Symbol" w:hint="default"/>
+      </w:rPr>
+    </w:lvl>
+    <w:lvl w:ilvl="7" w:tplc="04090003" w:tentative="1">
+      <w:start w:val="1"/>
+      <w:numFmt w:val="bullet"/>
+      <w:lvlText w:val="o"/>
+      <w:lvlJc w:val="left"/>
+      <w:pPr>
+        <w:ind w:left="6120" w:hanging="360"/>
+      </w:pPr>
+      <w:rPr>
+        <w:rFonts w:ascii="Courier New" w:hAnsi="Courier New" w:cs="Courier New" w:hint="default"/>
+      </w:rPr>
+    </w:lvl>
+    <w:lvl w:ilvl="8" w:tplc="04090005" w:tentative="1">
+      <w:start w:val="1"/>
+      <w:numFmt w:val="bullet"/>
+      <w:lvlText w:val=""/>
+      <w:lvlJc w:val="left"/>
+      <w:pPr>
+        <w:ind w:left="6840" w:hanging="360"/>
+      </w:pPr>
+      <w:rPr>
+        <w:rFonts w:ascii="Wingdings" w:hAnsi="Wingdings" w:hint="default"/>
+      </w:rPr>
+    </w:lvl>
+  </w:abstractNum>
+  <w:abstractNum w:abstractNumId="27" w15:restartNumberingAfterBreak="0">
     <w:nsid w:val="61DE5637"/>
     <w:multiLevelType w:val="multilevel"/>
     <w:tmpl w:val="7EE212F2"/>
@@ -19793,7 +20852,7 @@
       </w:rPr>
     </w:lvl>
   </w:abstractNum>
-  <w:abstractNum w:abstractNumId="27" w15:restartNumberingAfterBreak="0">
+  <w:abstractNum w:abstractNumId="28" w15:restartNumberingAfterBreak="0">
     <w:nsid w:val="6807321B"/>
     <w:multiLevelType w:val="hybridMultilevel"/>
     <w:tmpl w:val="D3063926"/>
@@ -19906,7 +20965,7 @@
       </w:rPr>
     </w:lvl>
   </w:abstractNum>
-  <w:abstractNum w:abstractNumId="28" w15:restartNumberingAfterBreak="0">
+  <w:abstractNum w:abstractNumId="29" w15:restartNumberingAfterBreak="0">
     <w:nsid w:val="6BC377C8"/>
     <w:multiLevelType w:val="multilevel"/>
     <w:tmpl w:val="10027020"/>
@@ -20028,7 +21087,7 @@
       </w:pPr>
     </w:lvl>
   </w:abstractNum>
-  <w:abstractNum w:abstractNumId="29" w15:restartNumberingAfterBreak="0">
+  <w:abstractNum w:abstractNumId="30" w15:restartNumberingAfterBreak="0">
     <w:nsid w:val="6C403360"/>
     <w:multiLevelType w:val="multilevel"/>
     <w:tmpl w:val="612C6148"/>
@@ -20088,7 +21147,7 @@
       <w:lvlJc w:val="left"/>
     </w:lvl>
   </w:abstractNum>
-  <w:abstractNum w:abstractNumId="30" w15:restartNumberingAfterBreak="0">
+  <w:abstractNum w:abstractNumId="31" w15:restartNumberingAfterBreak="0">
     <w:nsid w:val="75ED4D05"/>
     <w:multiLevelType w:val="multilevel"/>
     <w:tmpl w:val="E99A4ED2"/>
@@ -20237,7 +21296,7 @@
       </w:rPr>
     </w:lvl>
   </w:abstractNum>
-  <w:abstractNum w:abstractNumId="31" w15:restartNumberingAfterBreak="0">
+  <w:abstractNum w:abstractNumId="32" w15:restartNumberingAfterBreak="0">
     <w:nsid w:val="7AC81C4C"/>
     <w:multiLevelType w:val="multilevel"/>
     <w:tmpl w:val="AFB2D926"/>
@@ -20386,7 +21445,7 @@
       </w:rPr>
     </w:lvl>
   </w:abstractNum>
-  <w:abstractNum w:abstractNumId="32" w15:restartNumberingAfterBreak="0">
+  <w:abstractNum w:abstractNumId="33" w15:restartNumberingAfterBreak="0">
     <w:nsid w:val="7ECB02F4"/>
     <w:multiLevelType w:val="hybridMultilevel"/>
     <w:tmpl w:val="49E2E660"/>
@@ -20499,7 +21558,7 @@
       </w:rPr>
     </w:lvl>
   </w:abstractNum>
-  <w:abstractNum w:abstractNumId="33" w15:restartNumberingAfterBreak="0">
+  <w:abstractNum w:abstractNumId="34" w15:restartNumberingAfterBreak="0">
     <w:nsid w:val="7F506E66"/>
     <w:multiLevelType w:val="multilevel"/>
     <w:tmpl w:val="2D4AC65E"/>
@@ -20649,13 +21708,13 @@
     </w:lvl>
   </w:abstractNum>
   <w:num w:numId="1" w16cid:durableId="1140733963">
-    <w:abstractNumId w:val="29"/>
+    <w:abstractNumId w:val="30"/>
   </w:num>
   <w:num w:numId="2" w16cid:durableId="2072844989">
     <w:abstractNumId w:val="11"/>
   </w:num>
   <w:num w:numId="3" w16cid:durableId="739447198">
-    <w:abstractNumId w:val="30"/>
+    <w:abstractNumId w:val="31"/>
   </w:num>
   <w:num w:numId="4" w16cid:durableId="2103181818">
     <w:abstractNumId w:val="4"/>
@@ -20664,7 +21723,7 @@
     <w:abstractNumId w:val="19"/>
   </w:num>
   <w:num w:numId="6" w16cid:durableId="121467186">
-    <w:abstractNumId w:val="31"/>
+    <w:abstractNumId w:val="32"/>
   </w:num>
   <w:num w:numId="7" w16cid:durableId="728457451">
     <w:abstractNumId w:val="7"/>
@@ -20673,7 +21732,7 @@
     <w:abstractNumId w:val="22"/>
   </w:num>
   <w:num w:numId="9" w16cid:durableId="1854803020">
-    <w:abstractNumId w:val="28"/>
+    <w:abstractNumId w:val="29"/>
   </w:num>
   <w:num w:numId="10" w16cid:durableId="942767756">
     <w:abstractNumId w:val="10"/>
@@ -20691,7 +21750,7 @@
     <w:abstractNumId w:val="23"/>
   </w:num>
   <w:num w:numId="15" w16cid:durableId="1395472196">
-    <w:abstractNumId w:val="33"/>
+    <w:abstractNumId w:val="34"/>
   </w:num>
   <w:num w:numId="16" w16cid:durableId="234173772">
     <w:abstractNumId w:val="21"/>
@@ -20715,7 +21774,7 @@
     <w:abstractNumId w:val="3"/>
   </w:num>
   <w:num w:numId="23" w16cid:durableId="547957725">
-    <w:abstractNumId w:val="32"/>
+    <w:abstractNumId w:val="33"/>
   </w:num>
   <w:num w:numId="24" w16cid:durableId="1326283870">
     <w:abstractNumId w:val="1"/>
@@ -20727,7 +21786,7 @@
     <w:abstractNumId w:val="18"/>
   </w:num>
   <w:num w:numId="27" w16cid:durableId="702830475">
-    <w:abstractNumId w:val="26"/>
+    <w:abstractNumId w:val="27"/>
   </w:num>
   <w:num w:numId="28" w16cid:durableId="1031956817">
     <w:abstractNumId w:val="5"/>
@@ -20739,7 +21798,7 @@
     <w:abstractNumId w:val="20"/>
   </w:num>
   <w:num w:numId="31" w16cid:durableId="2029401303">
-    <w:abstractNumId w:val="27"/>
+    <w:abstractNumId w:val="28"/>
   </w:num>
   <w:num w:numId="32" w16cid:durableId="33384959">
     <w:abstractNumId w:val="9"/>
@@ -20749,6 +21808,9 @@
   </w:num>
   <w:num w:numId="34" w16cid:durableId="1630240737">
     <w:abstractNumId w:val="16"/>
+  </w:num>
+  <w:num w:numId="35" w16cid:durableId="895891708">
+    <w:abstractNumId w:val="26"/>
   </w:num>
   <w:numIdMacAtCleanup w:val="34"/>
 </w:numbering>
@@ -21279,6 +22341,9 @@
         <w:ilvl w:val="4"/>
         <w:numId w:val="29"/>
       </w:numPr>
+      <w:tabs>
+        <w:tab w:val="num" w:pos="360"/>
+      </w:tabs>
       <w:spacing w:before="80" w:after="40"/>
       <w:outlineLvl w:val="4"/>
     </w:pPr>
@@ -21304,6 +22369,9 @@
         <w:ilvl w:val="5"/>
         <w:numId w:val="29"/>
       </w:numPr>
+      <w:tabs>
+        <w:tab w:val="num" w:pos="360"/>
+      </w:tabs>
       <w:spacing w:before="40" w:after="0"/>
       <w:outlineLvl w:val="5"/>
     </w:pPr>
@@ -21331,6 +22399,9 @@
         <w:ilvl w:val="6"/>
         <w:numId w:val="29"/>
       </w:numPr>
+      <w:tabs>
+        <w:tab w:val="num" w:pos="360"/>
+      </w:tabs>
       <w:spacing w:before="40" w:after="0"/>
       <w:outlineLvl w:val="6"/>
     </w:pPr>
@@ -21356,6 +22427,9 @@
         <w:ilvl w:val="7"/>
         <w:numId w:val="29"/>
       </w:numPr>
+      <w:tabs>
+        <w:tab w:val="num" w:pos="360"/>
+      </w:tabs>
       <w:spacing w:after="0"/>
       <w:outlineLvl w:val="7"/>
     </w:pPr>
@@ -21383,6 +22457,9 @@
         <w:ilvl w:val="8"/>
         <w:numId w:val="29"/>
       </w:numPr>
+      <w:tabs>
+        <w:tab w:val="num" w:pos="360"/>
+      </w:tabs>
       <w:spacing w:after="0"/>
       <w:outlineLvl w:val="8"/>
     </w:pPr>

</xml_diff>